<commit_message>
Fit IC-ISHCT version to the 8-page limit
</commit_message>
<xml_diff>
--- a/paper/closed-loop-genui-ishct.docx
+++ b/paper/closed-loop-genui-ishct.docx
@@ -5367,7 +5367,7 @@
       <w:r>
         <w:drawing>
           <wp:inline>
-            <wp:extent cx="4206240" cy="2014441"/>
+            <wp:extent cx="3657600" cy="1751688"/>
             <wp:docPr id="3" name="Picture 3"/>
             <wp:cNvGraphicFramePr>
               <a:graphicFrameLocks noChangeAspect="1"/>
@@ -5388,7 +5388,7 @@
                   <pic:spPr>
                     <a:xfrm>
                       <a:off x="0" y="0"/>
-                      <a:ext cx="4206240" cy="2014441"/>
+                      <a:ext cx="3657600" cy="1751688"/>
                     </a:xfrm>
                     <a:prstGeom prst="rect"/>
                   </pic:spPr>
@@ -16487,7 +16487,7 @@
       <w:r>
         <w:drawing>
           <wp:inline>
-            <wp:extent cx="2571870" cy="1828800"/>
+            <wp:extent cx="2314683" cy="1645920"/>
             <wp:docPr id="3" name="Picture 3"/>
             <wp:cNvGraphicFramePr>
               <a:graphicFrameLocks noChangeAspect="1"/>
@@ -16508,7 +16508,7 @@
                   <pic:spPr>
                     <a:xfrm>
                       <a:off x="0" y="0"/>
-                      <a:ext cx="2571870" cy="1828800"/>
+                      <a:ext cx="2314683" cy="1645920"/>
                     </a:xfrm>
                     <a:prstGeom prst="rect"/>
                   </pic:spPr>
@@ -16524,7 +16524,7 @@
       <w:r>
         <w:drawing>
           <wp:inline>
-            <wp:extent cx="1961946" cy="1828800"/>
+            <wp:extent cx="1765751" cy="1645920"/>
             <wp:docPr id="4" name="Picture 4"/>
             <wp:cNvGraphicFramePr>
               <a:graphicFrameLocks noChangeAspect="1"/>
@@ -16545,7 +16545,7 @@
                   <pic:spPr>
                     <a:xfrm>
                       <a:off x="0" y="0"/>
-                      <a:ext cx="1961946" cy="1828800"/>
+                      <a:ext cx="1765751" cy="1645920"/>
                     </a:xfrm>
                     <a:prstGeom prst="rect"/>
                   </pic:spPr>
@@ -30041,7 +30041,7 @@
       <w:r>
         <w:drawing>
           <wp:inline>
-            <wp:extent cx="4206240" cy="1382050"/>
+            <wp:extent cx="3657600" cy="1201783"/>
             <wp:docPr id="3" name="Picture 3"/>
             <wp:cNvGraphicFramePr>
               <a:graphicFrameLocks noChangeAspect="1"/>
@@ -30062,7 +30062,7 @@
                   <pic:spPr>
                     <a:xfrm>
                       <a:off x="0" y="0"/>
-                      <a:ext cx="4206240" cy="1382050"/>
+                      <a:ext cx="3657600" cy="1201783"/>
                     </a:xfrm>
                     <a:prstGeom prst="rect"/>
                   </pic:spPr>
@@ -33690,7 +33690,7 @@
       <w:r>
         <w:drawing>
           <wp:inline>
-            <wp:extent cx="4206240" cy="1261872"/>
+            <wp:extent cx="3657600" cy="1097280"/>
             <wp:docPr id="3" name="Picture 3"/>
             <wp:cNvGraphicFramePr>
               <a:graphicFrameLocks noChangeAspect="1"/>
@@ -33711,7 +33711,7 @@
                   <pic:spPr>
                     <a:xfrm>
                       <a:off x="0" y="0"/>
-                      <a:ext cx="4206240" cy="1261872"/>
+                      <a:ext cx="3657600" cy="1097280"/>
                     </a:xfrm>
                     <a:prstGeom prst="rect"/>
                   </pic:spPr>

</xml_diff>